<commit_message>
Đặc tả v0.7: bỏ 409 LAST_ADMIN, dùng cơ chế chặn tự khóa/tự gỡ Admin (422)
Người thao tác luôn là một Admin đang hoạt động, và backend đã chặn Admin tự khóa
hoặc tự gỡ vai trò Admin của chính mình (422), nên hệ thống luôn còn ít nhất một
Admin; trường hợp "khóa Admin cuối cùng" không thể xảy ra. Sửa FR-01, FR-12, API
mục 7, truy vết mục 9 (file 0) và UC-06, UC-28 (file 3) cho khớp.

Co-Authored-By: Claude Opus 5.5 <noreply@anthropic.com>
</commit_message>
<xml_diff>
--- a/document/0 -Dac_ta_SDD_v0.7.docx
+++ b/document/0 -Dac_ta_SDD_v0.7.docx
@@ -3220,7 +3220,7 @@
           <w:sz w:val="20"/>
           <w:szCs w:val="20"/>
         </w:rPr>
-        <w:t>Tiêu chí nghiệm thu: Tài khoản sai hoặc bị khóa bị từ chối; truy cập endpoint trái quyền trả 403; thao tác quản trị được audit. Không khóa hoặc gỡ vai trò Admin của Admin đang hoạt động cuối cùng (409 LAST_ADMIN); Admin không tự khóa chính mình; đặt lại mật khẩu và buộc đăng xuất thu hồi mọi phiên của người đó.</w:t>
+        <w:t>Tiêu chí nghiệm thu: Tài khoản sai hoặc bị khóa bị từ chối; truy cập endpoint trái quyền trả 403; thao tác quản trị được audit. Admin không tự khóa hay tự gỡ vai trò Admin của chính mình (422), nhờ đó hệ thống luôn còn ít nhất một Admin đang hoạt động; đặt lại mật khẩu và buộc đăng xuất thu hồi mọi phiên của người đó.</w:t>
       </w:r>
       <w:r>
         <w:rPr>
@@ -4046,7 +4046,7 @@
           <w:sz w:val="20"/>
           <w:szCs w:val="20"/>
         </w:rPr>
-        <w:t>Tiêu chí nghiệm thu: Không tạo, xóa hay sửa quyền của vai trò từ giao diện; VIEWER xem theo D-02 (đã xuất bản, cùng phòng ban), không upload, sửa OCR, gửi duyệt, mượn hồ sơ (403); mọi vai trò tải được file gốc trong phạm vi xem, mỗi lượt tải ghi audit download_document (D-08); không gỡ được vai trò Admin của Admin đang hoạt động cuối cùng (409 LAST_ADMIN); thay đổi vai trò có audit và có hiệu lực ở request kế tiếp.</w:t>
+        <w:t>Tiêu chí nghiệm thu: Không tạo, xóa hay sửa quyền của vai trò từ giao diện; VIEWER xem theo D-02 (đã xuất bản, cùng phòng ban), không upload, sửa OCR, gửi duyệt, mượn hồ sơ (403); mọi vai trò tải được file gốc trong phạm vi xem, mỗi lượt tải ghi audit download_document (D-08); Admin không tự gỡ vai trò Admin của chính mình (422); thay đổi vai trò có audit và có hiệu lực ở request kế tiếp.</w:t>
       </w:r>
     </w:p>
     <w:p>
@@ -7397,7 +7397,7 @@
                 <w:sz w:val="16"/>
                 <w:szCs w:val="16"/>
               </w:rPr>
-              <w:t>FR-01: lọc, phân trang; buộc đăng xuất mọi phiên; khóa/gỡ Admin cuối → 409 LAST_ADMIN; audit</w:t>
+              <w:t>FR-01: lọc, phân trang; buộc đăng xuất mọi phiên; tự khóa hoặc tự gỡ vai trò Admin của chính mình → 422; audit</w:t>
             </w:r>
           </w:p>
         </w:tc>
@@ -12357,7 +12357,7 @@
                 <w:sz w:val="16"/>
                 <w:szCs w:val="16"/>
               </w:rPr>
-              <w:t>VIEWER chỉ thấy đã xuất bản; 403 khi sửa; tải có audit; 409 LAST_ADMIN</w:t>
+              <w:t>VIEWER chỉ thấy đã xuất bản; 403 khi sửa; tải có audit; không tự gỡ Admin (422)</w:t>
             </w:r>
           </w:p>
         </w:tc>

</xml_diff>